<commit_message>
revised SDS and MM
added 3 more sequence diagrams
added march 27th
</commit_message>
<xml_diff>
--- a/MeetingMinutes.docx
+++ b/MeetingMinutes.docx
@@ -2995,7 +2995,15 @@
     </w:p>
     <w:p>
       <w:r>
-        <w:t>The team and I discussed our plans on general requirements based on the lecture slides. We came up with some general requirements, did a few dry runs on our finished presentation, with not too many expectations set for the next meeting at the Project Init Stage.</w:t>
+        <w:t>The team and I discussed our plans on general requirements based on the lecture slides. We came up with some general requirements</w:t>
+      </w:r>
+      <w:proofErr w:type="gramStart"/>
+      <w:r>
+        <w:t>, did</w:t>
+      </w:r>
+      <w:proofErr w:type="gramEnd"/>
+      <w:r>
+        <w:t xml:space="preserve"> a few dry runs on our finished presentation, with not too many expectations set for the next meeting at the Project Init Stage.</w:t>
       </w:r>
     </w:p>
     <w:p>
@@ -3128,7 +3136,15 @@
     </w:p>
     <w:p>
       <w:r>
-        <w:t xml:space="preserve">In this meeting, which was isolated to Victor and I, we met about our </w:t>
+        <w:t xml:space="preserve">In this meeting, which was isolated to Victor and </w:t>
+      </w:r>
+      <w:proofErr w:type="gramStart"/>
+      <w:r>
+        <w:t>I</w:t>
+      </w:r>
+      <w:proofErr w:type="gramEnd"/>
+      <w:r>
+        <w:t xml:space="preserve">, we met about our </w:t>
       </w:r>
       <w:r>
         <w:t>plans to divide the work. After the lecture meeting on the 19</w:t>
@@ -3688,10 +3704,12 @@
         <w:t xml:space="preserve">, ready to merge fully with my own. </w:t>
       </w:r>
       <w:proofErr w:type="spellStart"/>
+      <w:proofErr w:type="gramStart"/>
       <w:r>
         <w:t>Clarize</w:t>
       </w:r>
       <w:proofErr w:type="spellEnd"/>
+      <w:proofErr w:type="gramEnd"/>
       <w:r>
         <w:t xml:space="preserve"> on March 12</w:t>
       </w:r>
@@ -4041,6 +4059,28 @@
       </w:r>
     </w:p>
     <w:p>
+      <w:r>
+        <w:t xml:space="preserve">The team discussed the overall Action items brought to this week’s meeting. Such as victor presenting his client network class which was forgotten last time. With </w:t>
+      </w:r>
+      <w:proofErr w:type="spellStart"/>
+      <w:r>
+        <w:t>Clarize</w:t>
+      </w:r>
+      <w:proofErr w:type="spellEnd"/>
+      <w:r>
+        <w:t xml:space="preserve"> bringing in her expected use cases and class diagrams in </w:t>
+      </w:r>
+      <w:proofErr w:type="spellStart"/>
+      <w:r>
+        <w:t>PlantUML</w:t>
+      </w:r>
+      <w:proofErr w:type="spellEnd"/>
+      <w:r>
+        <w:t xml:space="preserve"> format. Overall, this meeting focused on completing and reviewing any leftover use cases and class diagrams that still needed to be finished in our SDS document. </w:t>
+      </w:r>
+    </w:p>
+    <w:p/>
+    <w:p>
       <w:pPr>
         <w:pStyle w:val="Subtitle"/>
       </w:pPr>
@@ -4048,6 +4088,40 @@
         <w:t>Action Items</w:t>
       </w:r>
     </w:p>
+    <w:p>
+      <w:r>
+        <w:t xml:space="preserve">Darien: Will work out the class diagram in order to maintain and improve on the overall design of the application layout. </w:t>
+      </w:r>
+    </w:p>
+    <w:p>
+      <w:proofErr w:type="spellStart"/>
+      <w:r>
+        <w:lastRenderedPageBreak/>
+        <w:t>Clarize</w:t>
+      </w:r>
+      <w:proofErr w:type="spellEnd"/>
+      <w:r>
+        <w:t>: Will focus on doing some sequence diagrams that demonstrate the overall main and general use cases by the end user. In addition, also help work on the SDS documentation.</w:t>
+      </w:r>
+    </w:p>
+    <w:p>
+      <w:r>
+        <w:t xml:space="preserve">Victor: Will focus on doing some sequence diagrams that demonstrate the overall main and general use cases by the end user. In addition, will also update </w:t>
+      </w:r>
+      <w:proofErr w:type="gramStart"/>
+      <w:r>
+        <w:t xml:space="preserve">this </w:t>
+      </w:r>
+      <w:proofErr w:type="spellStart"/>
+      <w:r>
+        <w:t>weeks</w:t>
+      </w:r>
+      <w:proofErr w:type="spellEnd"/>
+      <w:proofErr w:type="gramEnd"/>
+      <w:r>
+        <w:t xml:space="preserve"> meeting minutes. </w:t>
+      </w:r>
+    </w:p>
     <w:p/>
     <w:p>
       <w:pPr>
@@ -4057,6 +4131,20 @@
         <w:t>By Next Meeting</w:t>
       </w:r>
     </w:p>
+    <w:p>
+      <w:r>
+        <w:t xml:space="preserve">The Action Items mentioned. An improved overall class diagram that will be discussed in next </w:t>
+      </w:r>
+      <w:proofErr w:type="spellStart"/>
+      <w:r>
+        <w:t>weeks</w:t>
+      </w:r>
+      <w:proofErr w:type="spellEnd"/>
+      <w:r>
+        <w:t xml:space="preserve"> meeting. </w:t>
+      </w:r>
+    </w:p>
+    <w:p/>
     <w:p/>
     <w:p>
       <w:pPr>
@@ -4096,7 +4184,6 @@
         <w:pStyle w:val="Subtitle"/>
       </w:pPr>
       <w:r>
-        <w:lastRenderedPageBreak/>
         <w:t>Abstract</w:t>
       </w:r>
     </w:p>
@@ -4119,7 +4206,15 @@
       </w:r>
       <w:proofErr w:type="spellEnd"/>
       <w:r>
-        <w:t xml:space="preserve"> introduced and walked through the general flows of the way users interact with the Communication Application System, generalizing a lot of the interactions. Victor mentioned that he was done with his Sequence Diagrams, but has not had the chance to upload it, but will do so by tomorrow after 6 pm. </w:t>
+        <w:t xml:space="preserve"> introduced and walked through the general flows of the way users interact with the Communication Application System, generalizing a lot of the interactions. Victor mentioned that he was done with his Sequence Diagrams, but has not had the chance to upload </w:t>
+      </w:r>
+      <w:proofErr w:type="gramStart"/>
+      <w:r>
+        <w:t>it</w:t>
+      </w:r>
+      <w:proofErr w:type="gramEnd"/>
+      <w:r>
+        <w:t xml:space="preserve">, but will do so by tomorrow after 6 pm. </w:t>
       </w:r>
     </w:p>
     <w:p>
@@ -4164,6 +4259,7 @@
         <w:pStyle w:val="Subtitle"/>
       </w:pPr>
       <w:r>
+        <w:lastRenderedPageBreak/>
         <w:t>By Next Meeting</w:t>
       </w:r>
     </w:p>
@@ -5535,7 +5631,6 @@
   <w:style w:type="character" w:default="1" w:styleId="DefaultParagraphFont">
     <w:name w:val="Default Paragraph Font"/>
     <w:uiPriority w:val="1"/>
-    <w:semiHidden/>
     <w:unhideWhenUsed/>
   </w:style>
   <w:style w:type="table" w:default="1" w:styleId="TableNormal">

</xml_diff>